<commit_message>
Refactor plan documentation to reflect Dockerized CI/CD implementation for MLOpsFull project
</commit_message>
<xml_diff>
--- a/Screenshots.docx
+++ b/Screenshots.docx
@@ -150,6 +150,218 @@
                   </pic:nvPicPr>
                   <pic:blipFill>
                     <a:blip r:embed="rId7"/>
+                    <a:stretch>
+                      <a:fillRect/>
+                    </a:stretch>
+                  </pic:blipFill>
+                  <pic:spPr>
+                    <a:xfrm>
+                      <a:off x="0" y="0"/>
+                      <a:ext cx="5731510" cy="3582035"/>
+                    </a:xfrm>
+                    <a:prstGeom prst="rect">
+                      <a:avLst/>
+                    </a:prstGeom>
+                  </pic:spPr>
+                </pic:pic>
+              </a:graphicData>
+            </a:graphic>
+          </wp:inline>
+        </w:drawing>
+      </w:r>
+    </w:p>
+    <w:p>
+      <w:r>
+        <w:rPr>
+          <w:noProof/>
+        </w:rPr>
+        <w:drawing>
+          <wp:inline distT="0" distB="0" distL="0" distR="0" wp14:anchorId="4C954560" wp14:editId="74F6A8E8">
+            <wp:extent cx="5731510" cy="3582035"/>
+            <wp:effectExtent l="0" t="0" r="2540" b="0"/>
+            <wp:docPr id="785321431" name="Picture 1"/>
+            <wp:cNvGraphicFramePr>
+              <a:graphicFrameLocks xmlns:a="http://schemas.openxmlformats.org/drawingml/2006/main" noChangeAspect="1"/>
+            </wp:cNvGraphicFramePr>
+            <a:graphic xmlns:a="http://schemas.openxmlformats.org/drawingml/2006/main">
+              <a:graphicData uri="http://schemas.openxmlformats.org/drawingml/2006/picture">
+                <pic:pic xmlns:pic="http://schemas.openxmlformats.org/drawingml/2006/picture">
+                  <pic:nvPicPr>
+                    <pic:cNvPr id="785321431" name=""/>
+                    <pic:cNvPicPr/>
+                  </pic:nvPicPr>
+                  <pic:blipFill>
+                    <a:blip r:embed="rId8"/>
+                    <a:stretch>
+                      <a:fillRect/>
+                    </a:stretch>
+                  </pic:blipFill>
+                  <pic:spPr>
+                    <a:xfrm>
+                      <a:off x="0" y="0"/>
+                      <a:ext cx="5731510" cy="3582035"/>
+                    </a:xfrm>
+                    <a:prstGeom prst="rect">
+                      <a:avLst/>
+                    </a:prstGeom>
+                  </pic:spPr>
+                </pic:pic>
+              </a:graphicData>
+            </a:graphic>
+          </wp:inline>
+        </w:drawing>
+      </w:r>
+    </w:p>
+    <w:p>
+      <w:r>
+        <w:rPr>
+          <w:noProof/>
+        </w:rPr>
+        <w:lastRenderedPageBreak/>
+        <w:drawing>
+          <wp:inline distT="0" distB="0" distL="0" distR="0" wp14:anchorId="24E8E9A0" wp14:editId="12037C39">
+            <wp:extent cx="5731510" cy="3582035"/>
+            <wp:effectExtent l="0" t="0" r="2540" b="0"/>
+            <wp:docPr id="1423884076" name="Picture 1"/>
+            <wp:cNvGraphicFramePr>
+              <a:graphicFrameLocks xmlns:a="http://schemas.openxmlformats.org/drawingml/2006/main" noChangeAspect="1"/>
+            </wp:cNvGraphicFramePr>
+            <a:graphic xmlns:a="http://schemas.openxmlformats.org/drawingml/2006/main">
+              <a:graphicData uri="http://schemas.openxmlformats.org/drawingml/2006/picture">
+                <pic:pic xmlns:pic="http://schemas.openxmlformats.org/drawingml/2006/picture">
+                  <pic:nvPicPr>
+                    <pic:cNvPr id="1423884076" name=""/>
+                    <pic:cNvPicPr/>
+                  </pic:nvPicPr>
+                  <pic:blipFill>
+                    <a:blip r:embed="rId9"/>
+                    <a:stretch>
+                      <a:fillRect/>
+                    </a:stretch>
+                  </pic:blipFill>
+                  <pic:spPr>
+                    <a:xfrm>
+                      <a:off x="0" y="0"/>
+                      <a:ext cx="5731510" cy="3582035"/>
+                    </a:xfrm>
+                    <a:prstGeom prst="rect">
+                      <a:avLst/>
+                    </a:prstGeom>
+                  </pic:spPr>
+                </pic:pic>
+              </a:graphicData>
+            </a:graphic>
+          </wp:inline>
+        </w:drawing>
+      </w:r>
+    </w:p>
+    <w:p>
+      <w:r>
+        <w:rPr>
+          <w:noProof/>
+        </w:rPr>
+        <w:drawing>
+          <wp:inline distT="0" distB="0" distL="0" distR="0" wp14:anchorId="09C388F0" wp14:editId="564C0D62">
+            <wp:extent cx="5731510" cy="3582035"/>
+            <wp:effectExtent l="0" t="0" r="2540" b="0"/>
+            <wp:docPr id="603859116" name="Picture 1"/>
+            <wp:cNvGraphicFramePr>
+              <a:graphicFrameLocks xmlns:a="http://schemas.openxmlformats.org/drawingml/2006/main" noChangeAspect="1"/>
+            </wp:cNvGraphicFramePr>
+            <a:graphic xmlns:a="http://schemas.openxmlformats.org/drawingml/2006/main">
+              <a:graphicData uri="http://schemas.openxmlformats.org/drawingml/2006/picture">
+                <pic:pic xmlns:pic="http://schemas.openxmlformats.org/drawingml/2006/picture">
+                  <pic:nvPicPr>
+                    <pic:cNvPr id="603859116" name=""/>
+                    <pic:cNvPicPr/>
+                  </pic:nvPicPr>
+                  <pic:blipFill>
+                    <a:blip r:embed="rId10"/>
+                    <a:stretch>
+                      <a:fillRect/>
+                    </a:stretch>
+                  </pic:blipFill>
+                  <pic:spPr>
+                    <a:xfrm>
+                      <a:off x="0" y="0"/>
+                      <a:ext cx="5731510" cy="3582035"/>
+                    </a:xfrm>
+                    <a:prstGeom prst="rect">
+                      <a:avLst/>
+                    </a:prstGeom>
+                  </pic:spPr>
+                </pic:pic>
+              </a:graphicData>
+            </a:graphic>
+          </wp:inline>
+        </w:drawing>
+      </w:r>
+    </w:p>
+    <w:p>
+      <w:r>
+        <w:rPr>
+          <w:noProof/>
+        </w:rPr>
+        <w:lastRenderedPageBreak/>
+        <w:drawing>
+          <wp:inline distT="0" distB="0" distL="0" distR="0" wp14:anchorId="157EB148" wp14:editId="78163FD4">
+            <wp:extent cx="5731510" cy="3582035"/>
+            <wp:effectExtent l="0" t="0" r="2540" b="0"/>
+            <wp:docPr id="985018256" name="Picture 1"/>
+            <wp:cNvGraphicFramePr>
+              <a:graphicFrameLocks xmlns:a="http://schemas.openxmlformats.org/drawingml/2006/main" noChangeAspect="1"/>
+            </wp:cNvGraphicFramePr>
+            <a:graphic xmlns:a="http://schemas.openxmlformats.org/drawingml/2006/main">
+              <a:graphicData uri="http://schemas.openxmlformats.org/drawingml/2006/picture">
+                <pic:pic xmlns:pic="http://schemas.openxmlformats.org/drawingml/2006/picture">
+                  <pic:nvPicPr>
+                    <pic:cNvPr id="985018256" name=""/>
+                    <pic:cNvPicPr/>
+                  </pic:nvPicPr>
+                  <pic:blipFill>
+                    <a:blip r:embed="rId11"/>
+                    <a:stretch>
+                      <a:fillRect/>
+                    </a:stretch>
+                  </pic:blipFill>
+                  <pic:spPr>
+                    <a:xfrm>
+                      <a:off x="0" y="0"/>
+                      <a:ext cx="5731510" cy="3582035"/>
+                    </a:xfrm>
+                    <a:prstGeom prst="rect">
+                      <a:avLst/>
+                    </a:prstGeom>
+                  </pic:spPr>
+                </pic:pic>
+              </a:graphicData>
+            </a:graphic>
+          </wp:inline>
+        </w:drawing>
+      </w:r>
+    </w:p>
+    <w:p>
+      <w:r>
+        <w:rPr>
+          <w:noProof/>
+        </w:rPr>
+        <w:drawing>
+          <wp:inline distT="0" distB="0" distL="0" distR="0" wp14:anchorId="015DBE78" wp14:editId="2DF8A1F3">
+            <wp:extent cx="5731510" cy="3582035"/>
+            <wp:effectExtent l="0" t="0" r="2540" b="0"/>
+            <wp:docPr id="213580564" name="Picture 1"/>
+            <wp:cNvGraphicFramePr>
+              <a:graphicFrameLocks xmlns:a="http://schemas.openxmlformats.org/drawingml/2006/main" noChangeAspect="1"/>
+            </wp:cNvGraphicFramePr>
+            <a:graphic xmlns:a="http://schemas.openxmlformats.org/drawingml/2006/main">
+              <a:graphicData uri="http://schemas.openxmlformats.org/drawingml/2006/picture">
+                <pic:pic xmlns:pic="http://schemas.openxmlformats.org/drawingml/2006/picture">
+                  <pic:nvPicPr>
+                    <pic:cNvPr id="213580564" name=""/>
+                    <pic:cNvPicPr/>
+                  </pic:nvPicPr>
+                  <pic:blipFill>
+                    <a:blip r:embed="rId12"/>
                     <a:stretch>
                       <a:fillRect/>
                     </a:stretch>

</xml_diff>